<commit_message>
feat: add asset_group parsing, use first element to render
</commit_message>
<xml_diff>
--- a/computer_debugging_new.docx
+++ b/computer_debugging_new.docx
@@ -1092,7 +1092,7 @@
               <w:rPr>
                 <w:b/>
               </w:rPr>
-              <w:t>Stellwerk: Praterstern</w:t>
+              <w:t>Stellwerk: {{asset_group}}</w:t>
             </w:r>
             <w:r>
               <w:rPr>
@@ -2608,8 +2608,8 @@
         <w:pStyle w:val="Normal"/>
         <w:rPr/>
       </w:pPr>
-      <w:bookmarkStart w:id="5" w:name="_Toc473541593"/>
-      <w:bookmarkStart w:id="6" w:name="_Ref48023021"/>
+      <w:bookmarkStart w:id="5" w:name="_Ref48023021"/>
+      <w:bookmarkStart w:id="6" w:name="_Toc473541593"/>
       <w:r>
         <w:rPr/>
         <w:t>Allgemeines</w:t>
@@ -3038,10 +3038,10 @@
       </w:tblPr>
       <w:tblGrid>
         <w:gridCol w:w="2520"/>
-        <w:gridCol w:w="1818"/>
-        <w:gridCol w:w="1820"/>
-        <w:gridCol w:w="1710"/>
-        <w:gridCol w:w="1618"/>
+        <w:gridCol w:w="1817"/>
+        <w:gridCol w:w="1821"/>
+        <w:gridCol w:w="1709"/>
+        <w:gridCol w:w="1619"/>
       </w:tblGrid>
       <w:tr>
         <w:trPr/>
@@ -3075,7 +3075,7 @@
         </w:tc>
         <w:tc>
           <w:tcPr>
-            <w:tcW w:w="1818" w:type="dxa"/>
+            <w:tcW w:w="1817" w:type="dxa"/>
             <w:tcBorders>
               <w:end w:val="nil"/>
             </w:tcBorders>
@@ -3105,7 +3105,7 @@
         </w:tc>
         <w:tc>
           <w:tcPr>
-            <w:tcW w:w="1820" w:type="dxa"/>
+            <w:tcW w:w="1821" w:type="dxa"/>
             <w:tcBorders/>
             <w:shd w:color="auto" w:fill="BFBFBF" w:themeFill="background1" w:themeFillShade="bf" w:val="clear"/>
           </w:tcPr>
@@ -3133,7 +3133,7 @@
         </w:tc>
         <w:tc>
           <w:tcPr>
-            <w:tcW w:w="1710" w:type="dxa"/>
+            <w:tcW w:w="1709" w:type="dxa"/>
             <w:tcBorders/>
             <w:shd w:color="auto" w:fill="BFBFBF" w:themeFill="background1" w:themeFillShade="bf" w:val="clear"/>
           </w:tcPr>
@@ -3161,7 +3161,7 @@
         </w:tc>
         <w:tc>
           <w:tcPr>
-            <w:tcW w:w="1618" w:type="dxa"/>
+            <w:tcW w:w="1619" w:type="dxa"/>
             <w:tcBorders/>
             <w:shd w:color="auto" w:fill="BFBFBF" w:themeFill="background1" w:themeFillShade="bf" w:val="clear"/>
           </w:tcPr>
@@ -3226,7 +3226,7 @@
         </w:tc>
         <w:tc>
           <w:tcPr>
-            <w:tcW w:w="1818" w:type="dxa"/>
+            <w:tcW w:w="1817" w:type="dxa"/>
             <w:tcBorders>
               <w:end w:val="nil"/>
             </w:tcBorders>
@@ -3253,7 +3253,7 @@
         </w:tc>
         <w:tc>
           <w:tcPr>
-            <w:tcW w:w="1820" w:type="dxa"/>
+            <w:tcW w:w="1821" w:type="dxa"/>
             <w:tcBorders>
               <w:end w:val="nil"/>
             </w:tcBorders>
@@ -3285,7 +3285,7 @@
         </w:tc>
         <w:tc>
           <w:tcPr>
-            <w:tcW w:w="1710" w:type="dxa"/>
+            <w:tcW w:w="1709" w:type="dxa"/>
             <w:tcBorders>
               <w:end w:val="nil"/>
             </w:tcBorders>
@@ -3317,7 +3317,7 @@
         </w:tc>
         <w:tc>
           <w:tcPr>
-            <w:tcW w:w="1618" w:type="dxa"/>
+            <w:tcW w:w="1619" w:type="dxa"/>
             <w:tcBorders/>
           </w:tcPr>
           <w:p>
@@ -3391,17 +3391,17 @@
         <w:tblLook w:noHBand="0" w:noVBand="1" w:firstColumn="1" w:lastRow="0" w:lastColumn="0" w:firstRow="1" w:val="04a0"/>
       </w:tblPr>
       <w:tblGrid>
-        <w:gridCol w:w="2345"/>
+        <w:gridCol w:w="2344"/>
         <w:gridCol w:w="2346"/>
         <w:gridCol w:w="1695"/>
         <w:gridCol w:w="1593"/>
-        <w:gridCol w:w="1507"/>
+        <w:gridCol w:w="1508"/>
       </w:tblGrid>
       <w:tr>
         <w:trPr/>
         <w:tc>
           <w:tcPr>
-            <w:tcW w:w="2345" w:type="dxa"/>
+            <w:tcW w:w="2344" w:type="dxa"/>
             <w:tcBorders>
               <w:end w:val="nil"/>
             </w:tcBorders>
@@ -3515,7 +3515,7 @@
         </w:tc>
         <w:tc>
           <w:tcPr>
-            <w:tcW w:w="1507" w:type="dxa"/>
+            <w:tcW w:w="1508" w:type="dxa"/>
             <w:tcBorders/>
             <w:shd w:color="auto" w:fill="BFBFBF" w:themeFill="background1" w:themeFillShade="bf" w:val="clear"/>
           </w:tcPr>
@@ -3548,7 +3548,7 @@
         </w:trPr>
         <w:tc>
           <w:tcPr>
-            <w:tcW w:w="2345" w:type="dxa"/>
+            <w:tcW w:w="2344" w:type="dxa"/>
             <w:tcBorders>
               <w:end w:val="nil"/>
             </w:tcBorders>
@@ -3671,7 +3671,7 @@
         </w:tc>
         <w:tc>
           <w:tcPr>
-            <w:tcW w:w="1507" w:type="dxa"/>
+            <w:tcW w:w="1508" w:type="dxa"/>
             <w:tcBorders/>
           </w:tcPr>
           <w:p>
@@ -3745,16 +3745,16 @@
         <w:tblLook w:noHBand="0" w:noVBand="1" w:firstColumn="1" w:lastRow="0" w:lastColumn="0" w:firstRow="1" w:val="04a0"/>
       </w:tblPr>
       <w:tblGrid>
-        <w:gridCol w:w="2345"/>
+        <w:gridCol w:w="2344"/>
         <w:gridCol w:w="2346"/>
         <w:gridCol w:w="1695"/>
-        <w:gridCol w:w="3100"/>
+        <w:gridCol w:w="3101"/>
       </w:tblGrid>
       <w:tr>
         <w:trPr/>
         <w:tc>
           <w:tcPr>
-            <w:tcW w:w="2345" w:type="dxa"/>
+            <w:tcW w:w="2344" w:type="dxa"/>
             <w:tcBorders>
               <w:end w:val="nil"/>
             </w:tcBorders>
@@ -3840,7 +3840,7 @@
         </w:tc>
         <w:tc>
           <w:tcPr>
-            <w:tcW w:w="3100" w:type="dxa"/>
+            <w:tcW w:w="3101" w:type="dxa"/>
             <w:tcBorders/>
             <w:shd w:color="auto" w:fill="BFBFBF" w:themeFill="background1" w:themeFillShade="bf" w:val="clear"/>
           </w:tcPr>
@@ -3873,7 +3873,7 @@
         </w:trPr>
         <w:tc>
           <w:tcPr>
-            <w:tcW w:w="2345" w:type="dxa"/>
+            <w:tcW w:w="2344" w:type="dxa"/>
             <w:tcBorders>
               <w:end w:val="nil"/>
             </w:tcBorders>
@@ -3964,7 +3964,7 @@
         </w:tc>
         <w:tc>
           <w:tcPr>
-            <w:tcW w:w="3100" w:type="dxa"/>
+            <w:tcW w:w="3101" w:type="dxa"/>
             <w:tcBorders/>
           </w:tcPr>
           <w:p>
@@ -4038,16 +4038,16 @@
         <w:tblLook w:noHBand="0" w:noVBand="1" w:firstColumn="1" w:lastRow="0" w:lastColumn="0" w:firstRow="1" w:val="04a0"/>
       </w:tblPr>
       <w:tblGrid>
-        <w:gridCol w:w="2345"/>
+        <w:gridCol w:w="2344"/>
         <w:gridCol w:w="2346"/>
         <w:gridCol w:w="1695"/>
-        <w:gridCol w:w="3100"/>
+        <w:gridCol w:w="3101"/>
       </w:tblGrid>
       <w:tr>
         <w:trPr/>
         <w:tc>
           <w:tcPr>
-            <w:tcW w:w="2345" w:type="dxa"/>
+            <w:tcW w:w="2344" w:type="dxa"/>
             <w:tcBorders>
               <w:end w:val="nil"/>
             </w:tcBorders>
@@ -4133,7 +4133,7 @@
         </w:tc>
         <w:tc>
           <w:tcPr>
-            <w:tcW w:w="3100" w:type="dxa"/>
+            <w:tcW w:w="3101" w:type="dxa"/>
             <w:tcBorders/>
             <w:shd w:color="auto" w:fill="BFBFBF" w:themeFill="background1" w:themeFillShade="bf" w:val="clear"/>
           </w:tcPr>
@@ -4166,7 +4166,7 @@
         </w:trPr>
         <w:tc>
           <w:tcPr>
-            <w:tcW w:w="2345" w:type="dxa"/>
+            <w:tcW w:w="2344" w:type="dxa"/>
             <w:tcBorders>
               <w:end w:val="nil"/>
             </w:tcBorders>
@@ -4257,7 +4257,7 @@
         </w:tc>
         <w:tc>
           <w:tcPr>
-            <w:tcW w:w="3100" w:type="dxa"/>
+            <w:tcW w:w="3101" w:type="dxa"/>
             <w:tcBorders/>
           </w:tcPr>
           <w:p>
@@ -4331,9 +4331,9 @@
         <w:tblLook w:noHBand="0" w:noVBand="1" w:firstColumn="1" w:lastRow="0" w:lastColumn="0" w:firstRow="1" w:val="04a0"/>
       </w:tblPr>
       <w:tblGrid>
-        <w:gridCol w:w="1165"/>
+        <w:gridCol w:w="1164"/>
         <w:gridCol w:w="1168"/>
-        <w:gridCol w:w="2384"/>
+        <w:gridCol w:w="2385"/>
         <w:gridCol w:w="2385"/>
         <w:gridCol w:w="2384"/>
       </w:tblGrid>
@@ -4341,7 +4341,7 @@
         <w:trPr/>
         <w:tc>
           <w:tcPr>
-            <w:tcW w:w="1165" w:type="dxa"/>
+            <w:tcW w:w="1164" w:type="dxa"/>
             <w:tcBorders>
               <w:end w:val="nil"/>
             </w:tcBorders>
@@ -4399,7 +4399,7 @@
         </w:tc>
         <w:tc>
           <w:tcPr>
-            <w:tcW w:w="2384" w:type="dxa"/>
+            <w:tcW w:w="2385" w:type="dxa"/>
             <w:tcBorders>
               <w:end w:val="nil"/>
             </w:tcBorders>
@@ -4492,7 +4492,7 @@
         </w:trPr>
         <w:tc>
           <w:tcPr>
-            <w:tcW w:w="1165" w:type="dxa"/>
+            <w:tcW w:w="1164" w:type="dxa"/>
             <w:tcBorders>
               <w:end w:val="nil"/>
             </w:tcBorders>
@@ -4564,7 +4564,7 @@
         </w:tc>
         <w:tc>
           <w:tcPr>
-            <w:tcW w:w="2384" w:type="dxa"/>
+            <w:tcW w:w="2385" w:type="dxa"/>
             <w:tcBorders>
               <w:end w:val="nil"/>
             </w:tcBorders>
@@ -4642,15 +4642,7 @@
             </w:pPr>
             <w:r>
               <w:rPr/>
-              <w:t>{{components_graphiccard_</w:t>
-            </w:r>
-            <w:r>
-              <w:rPr/>
-              <w:t>comment</w:t>
-            </w:r>
-            <w:r>
-              <w:rPr/>
-              <w:t>}}</w:t>
+              <w:t>{{components_graphiccard_comment}}</w:t>
             </w:r>
           </w:p>
         </w:tc>
@@ -4701,8 +4693,8 @@
       </w:tblPr>
       <w:tblGrid>
         <w:gridCol w:w="2575"/>
-        <w:gridCol w:w="1858"/>
-        <w:gridCol w:w="1749"/>
+        <w:gridCol w:w="1857"/>
+        <w:gridCol w:w="1750"/>
         <w:gridCol w:w="1653"/>
         <w:gridCol w:w="1651"/>
       </w:tblGrid>
@@ -4738,7 +4730,7 @@
         </w:tc>
         <w:tc>
           <w:tcPr>
-            <w:tcW w:w="1858" w:type="dxa"/>
+            <w:tcW w:w="1857" w:type="dxa"/>
             <w:tcBorders/>
             <w:shd w:color="auto" w:fill="BFBFBF" w:themeFill="background1" w:themeFillShade="bf" w:val="clear"/>
           </w:tcPr>
@@ -4766,7 +4758,7 @@
         </w:tc>
         <w:tc>
           <w:tcPr>
-            <w:tcW w:w="1749" w:type="dxa"/>
+            <w:tcW w:w="1750" w:type="dxa"/>
             <w:tcBorders/>
             <w:shd w:color="auto" w:fill="BFBFBF" w:themeFill="background1" w:themeFillShade="bf" w:val="clear"/>
           </w:tcPr>
@@ -4889,7 +4881,7 @@
         </w:tc>
         <w:tc>
           <w:tcPr>
-            <w:tcW w:w="1858" w:type="dxa"/>
+            <w:tcW w:w="1857" w:type="dxa"/>
             <w:tcBorders>
               <w:end w:val="nil"/>
             </w:tcBorders>
@@ -4921,7 +4913,7 @@
         </w:tc>
         <w:tc>
           <w:tcPr>
-            <w:tcW w:w="1749" w:type="dxa"/>
+            <w:tcW w:w="1750" w:type="dxa"/>
             <w:tcBorders>
               <w:end w:val="nil"/>
             </w:tcBorders>
@@ -5400,7 +5392,7 @@
             <w:rPr>
               <w:sz w:val="18"/>
             </w:rPr>
-            <w:t>3</w:t>
+            <w:t>4</w:t>
           </w:r>
           <w:r>
             <w:rPr>
@@ -5500,7 +5492,7 @@
             <w:rPr>
               <w:sz w:val="18"/>
             </w:rPr>
-            <w:t>Stellwerk: Praterstern</w:t>
+            <w:t>Stellwerk: {{asset_group}}</w:t>
           </w:r>
           <w:r>
             <w:rPr>
@@ -6046,7 +6038,7 @@
             <w:rPr>
               <w:sz w:val="18"/>
             </w:rPr>
-            <w:t>3</w:t>
+            <w:t>4</w:t>
           </w:r>
           <w:r>
             <w:rPr>
@@ -6146,7 +6138,7 @@
             <w:rPr>
               <w:sz w:val="18"/>
             </w:rPr>
-            <w:t>Stellwerk: Praterstern</w:t>
+            <w:t>Stellwerk: {{asset_group}}</w:t>
           </w:r>
           <w:r>
             <w:rPr>
@@ -6381,8 +6373,8 @@
       <w:tblLook w:noHBand="0" w:noVBand="0" w:firstColumn="0" w:lastRow="0" w:lastColumn="0" w:firstRow="0" w:val="0000"/>
     </w:tblPr>
     <w:tblGrid>
-      <w:gridCol w:w="2545"/>
-      <w:gridCol w:w="7095"/>
+      <w:gridCol w:w="2544"/>
+      <w:gridCol w:w="7096"/>
     </w:tblGrid>
     <w:tr>
       <w:trPr>
@@ -6390,7 +6382,7 @@
       </w:trPr>
       <w:tc>
         <w:tcPr>
-          <w:tcW w:w="2545" w:type="dxa"/>
+          <w:tcW w:w="2544" w:type="dxa"/>
           <w:tcBorders>
             <w:bottom w:val="single" w:sz="12" w:space="0" w:color="000000"/>
           </w:tcBorders>
@@ -6425,14 +6417,14 @@
               <v:shape id="ole_rId1" type="_x0000_tole_rId1" style="width:114.6pt;height:19.8pt;mso-wrap-distance-right:0pt" filled="f" o:ole="">
                 <v:imagedata r:id="rId2" o:title=""/>
               </v:shape>
-              <o:OLEObject Type="Embed" ProgID="MSDraw" ShapeID="ole_rId1" DrawAspect="Content" ObjectID="_1122085717" r:id="rId1"/>
+              <o:OLEObject Type="Embed" ProgID="MSDraw" ShapeID="ole_rId1" DrawAspect="Content" ObjectID="_1379086440" r:id="rId1"/>
             </w:object>
           </w:r>
         </w:p>
       </w:tc>
       <w:tc>
         <w:tcPr>
-          <w:tcW w:w="7095" w:type="dxa"/>
+          <w:tcW w:w="7096" w:type="dxa"/>
           <w:tcBorders>
             <w:bottom w:val="single" w:sz="12" w:space="0" w:color="000000"/>
           </w:tcBorders>
@@ -6483,8 +6475,8 @@
       <w:tblLook w:noHBand="0" w:noVBand="0" w:firstColumn="0" w:lastRow="0" w:lastColumn="0" w:firstRow="0" w:val="0000"/>
     </w:tblPr>
     <w:tblGrid>
-      <w:gridCol w:w="2545"/>
-      <w:gridCol w:w="7095"/>
+      <w:gridCol w:w="2544"/>
+      <w:gridCol w:w="7096"/>
     </w:tblGrid>
     <w:tr>
       <w:trPr>
@@ -6492,7 +6484,7 @@
       </w:trPr>
       <w:tc>
         <w:tcPr>
-          <w:tcW w:w="2545" w:type="dxa"/>
+          <w:tcW w:w="2544" w:type="dxa"/>
           <w:tcBorders>
             <w:bottom w:val="single" w:sz="12" w:space="0" w:color="000000"/>
           </w:tcBorders>
@@ -6527,14 +6519,14 @@
               <v:shape id="ole_rId1" type="_x0000_tole_rId1" style="width:114.6pt;height:19.8pt;mso-wrap-distance-right:0pt" filled="f" o:ole="">
                 <v:imagedata r:id="rId2" o:title=""/>
               </v:shape>
-              <o:OLEObject Type="Embed" ProgID="MSDraw" ShapeID="ole_rId1" DrawAspect="Content" ObjectID="_191775979" r:id="rId1"/>
+              <o:OLEObject Type="Embed" ProgID="MSDraw" ShapeID="ole_rId1" DrawAspect="Content" ObjectID="_2003948364" r:id="rId1"/>
             </w:object>
           </w:r>
         </w:p>
       </w:tc>
       <w:tc>
         <w:tcPr>
-          <w:tcW w:w="7095" w:type="dxa"/>
+          <w:tcW w:w="7096" w:type="dxa"/>
           <w:tcBorders>
             <w:bottom w:val="single" w:sz="12" w:space="0" w:color="000000"/>
           </w:tcBorders>
@@ -8058,15 +8050,15 @@
       <w:lang w:val="de-DE" w:eastAsia="de-DE"/>
     </w:rPr>
   </w:style>
-  <w:style w:type="character" w:styleId="FootnoteCharacters">
-    <w:name w:val="Footnote Characters"/>
+  <w:style w:type="character" w:styleId="FootnoteCharactersuser">
+    <w:name w:val="Footnote Characters (user)"/>
     <w:qFormat/>
     <w:rPr>
       <w:vertAlign w:val="superscript"/>
     </w:rPr>
   </w:style>
-  <w:style w:type="character" w:styleId="FootnoteCharactersuser">
-    <w:name w:val="Footnote Characters (user)"/>
+  <w:style w:type="character" w:styleId="FootnoteCharacters">
+    <w:name w:val="Footnote Characters"/>
     <w:qFormat/>
     <w:rPr>
       <w:vertAlign w:val="superscript"/>
@@ -8833,15 +8825,15 @@
       <w:lang w:val="es-ES"/>
     </w:rPr>
   </w:style>
-  <w:style w:type="paragraph" w:styleId="FrameContents">
-    <w:name w:val="Frame Contents"/>
+  <w:style w:type="paragraph" w:styleId="FrameContentsuser">
+    <w:name w:val="Frame Contents (user)"/>
     <w:basedOn w:val="Normal"/>
     <w:qFormat/>
     <w:pPr/>
     <w:rPr/>
   </w:style>
-  <w:style w:type="paragraph" w:styleId="FrameContentsuser">
-    <w:name w:val="Frame Contents (user)"/>
+  <w:style w:type="paragraph" w:styleId="FrameContents">
+    <w:name w:val="Frame Contents"/>
     <w:basedOn w:val="Normal"/>
     <w:qFormat/>
     <w:pPr/>

</xml_diff>

<commit_message>
feat: add hostname handling
</commit_message>
<xml_diff>
--- a/computer_debugging_new.docx
+++ b/computer_debugging_new.docx
@@ -146,7 +146,7 @@
           <w:sz w:val="44"/>
           <w:lang w:val="de-AT"/>
         </w:rPr>
-        <w:t>{{asset_type}} {{asset_name}} {{asset_location}}</w:t>
+        <w:t>{{asset_name}}</w:t>
       </w:r>
     </w:p>
     <w:p>
@@ -2608,8 +2608,8 @@
         <w:pStyle w:val="Normal"/>
         <w:rPr/>
       </w:pPr>
-      <w:bookmarkStart w:id="5" w:name="_Ref48023021"/>
-      <w:bookmarkStart w:id="6" w:name="_Toc473541593"/>
+      <w:bookmarkStart w:id="5" w:name="_Toc473541593"/>
+      <w:bookmarkStart w:id="6" w:name="_Ref48023021"/>
       <w:r>
         <w:rPr/>
         <w:t>Allgemeines</w:t>
@@ -2702,7 +2702,7 @@
                 <w:szCs w:val="18"/>
                 <w:lang w:bidi="ar-SA"/>
               </w:rPr>
-              <w:t>{{asset_name}}</w:t>
+              <w:t>{{asset_hostname}}</w:t>
             </w:r>
           </w:p>
         </w:tc>
@@ -2758,7 +2758,7 @@
                 <w:szCs w:val="18"/>
                 <w:lang w:val="fr-FR" w:bidi="ar-SA"/>
               </w:rPr>
-              <w:t>{{field_comment}}</w:t>
+              <w:t>{{asset_name}}</w:t>
             </w:r>
           </w:p>
         </w:tc>
@@ -2863,7 +2863,19 @@
               <w:rPr>
                 <w:lang w:val="pt-PT"/>
               </w:rPr>
-              <w:t>{{asset_type}}</w:t>
+              <w:t>{{asset_</w:t>
+            </w:r>
+            <w:r>
+              <w:rPr>
+                <w:lang w:val="pt-PT"/>
+              </w:rPr>
+              <w:t>model</w:t>
+            </w:r>
+            <w:r>
+              <w:rPr>
+                <w:lang w:val="pt-PT"/>
+              </w:rPr>
+              <w:t>}}</w:t>
             </w:r>
           </w:p>
         </w:tc>
@@ -3038,10 +3050,10 @@
       </w:tblPr>
       <w:tblGrid>
         <w:gridCol w:w="2520"/>
-        <w:gridCol w:w="1817"/>
-        <w:gridCol w:w="1821"/>
-        <w:gridCol w:w="1709"/>
-        <w:gridCol w:w="1619"/>
+        <w:gridCol w:w="1816"/>
+        <w:gridCol w:w="1822"/>
+        <w:gridCol w:w="1706"/>
+        <w:gridCol w:w="1622"/>
       </w:tblGrid>
       <w:tr>
         <w:trPr/>
@@ -3075,7 +3087,7 @@
         </w:tc>
         <w:tc>
           <w:tcPr>
-            <w:tcW w:w="1817" w:type="dxa"/>
+            <w:tcW w:w="1816" w:type="dxa"/>
             <w:tcBorders>
               <w:end w:val="nil"/>
             </w:tcBorders>
@@ -3105,7 +3117,7 @@
         </w:tc>
         <w:tc>
           <w:tcPr>
-            <w:tcW w:w="1821" w:type="dxa"/>
+            <w:tcW w:w="1822" w:type="dxa"/>
             <w:tcBorders/>
             <w:shd w:color="auto" w:fill="BFBFBF" w:themeFill="background1" w:themeFillShade="bf" w:val="clear"/>
           </w:tcPr>
@@ -3133,7 +3145,7 @@
         </w:tc>
         <w:tc>
           <w:tcPr>
-            <w:tcW w:w="1709" w:type="dxa"/>
+            <w:tcW w:w="1706" w:type="dxa"/>
             <w:tcBorders/>
             <w:shd w:color="auto" w:fill="BFBFBF" w:themeFill="background1" w:themeFillShade="bf" w:val="clear"/>
           </w:tcPr>
@@ -3161,7 +3173,7 @@
         </w:tc>
         <w:tc>
           <w:tcPr>
-            <w:tcW w:w="1619" w:type="dxa"/>
+            <w:tcW w:w="1622" w:type="dxa"/>
             <w:tcBorders/>
             <w:shd w:color="auto" w:fill="BFBFBF" w:themeFill="background1" w:themeFillShade="bf" w:val="clear"/>
           </w:tcPr>
@@ -3226,7 +3238,7 @@
         </w:tc>
         <w:tc>
           <w:tcPr>
-            <w:tcW w:w="1817" w:type="dxa"/>
+            <w:tcW w:w="1816" w:type="dxa"/>
             <w:tcBorders>
               <w:end w:val="nil"/>
             </w:tcBorders>
@@ -3253,7 +3265,7 @@
         </w:tc>
         <w:tc>
           <w:tcPr>
-            <w:tcW w:w="1821" w:type="dxa"/>
+            <w:tcW w:w="1822" w:type="dxa"/>
             <w:tcBorders>
               <w:end w:val="nil"/>
             </w:tcBorders>
@@ -3285,7 +3297,7 @@
         </w:tc>
         <w:tc>
           <w:tcPr>
-            <w:tcW w:w="1709" w:type="dxa"/>
+            <w:tcW w:w="1706" w:type="dxa"/>
             <w:tcBorders>
               <w:end w:val="nil"/>
             </w:tcBorders>
@@ -3317,7 +3329,7 @@
         </w:tc>
         <w:tc>
           <w:tcPr>
-            <w:tcW w:w="1619" w:type="dxa"/>
+            <w:tcW w:w="1622" w:type="dxa"/>
             <w:tcBorders/>
           </w:tcPr>
           <w:p>
@@ -3391,17 +3403,17 @@
         <w:tblLook w:noHBand="0" w:noVBand="1" w:firstColumn="1" w:lastRow="0" w:lastColumn="0" w:firstRow="1" w:val="04a0"/>
       </w:tblPr>
       <w:tblGrid>
+        <w:gridCol w:w="2343"/>
         <w:gridCol w:w="2344"/>
-        <w:gridCol w:w="2346"/>
-        <w:gridCol w:w="1695"/>
-        <w:gridCol w:w="1593"/>
-        <w:gridCol w:w="1508"/>
+        <w:gridCol w:w="1698"/>
+        <w:gridCol w:w="1590"/>
+        <w:gridCol w:w="1511"/>
       </w:tblGrid>
       <w:tr>
         <w:trPr/>
         <w:tc>
           <w:tcPr>
-            <w:tcW w:w="2344" w:type="dxa"/>
+            <w:tcW w:w="2343" w:type="dxa"/>
             <w:tcBorders>
               <w:end w:val="nil"/>
             </w:tcBorders>
@@ -3431,7 +3443,7 @@
         </w:tc>
         <w:tc>
           <w:tcPr>
-            <w:tcW w:w="2346" w:type="dxa"/>
+            <w:tcW w:w="2344" w:type="dxa"/>
             <w:tcBorders/>
             <w:shd w:color="auto" w:fill="BFBFBF" w:themeFill="background1" w:themeFillShade="bf" w:val="clear"/>
           </w:tcPr>
@@ -3459,7 +3471,7 @@
         </w:tc>
         <w:tc>
           <w:tcPr>
-            <w:tcW w:w="1695" w:type="dxa"/>
+            <w:tcW w:w="1698" w:type="dxa"/>
             <w:tcBorders/>
             <w:shd w:color="auto" w:fill="BFBFBF" w:themeFill="background1" w:themeFillShade="bf" w:val="clear"/>
           </w:tcPr>
@@ -3487,7 +3499,7 @@
         </w:tc>
         <w:tc>
           <w:tcPr>
-            <w:tcW w:w="1593" w:type="dxa"/>
+            <w:tcW w:w="1590" w:type="dxa"/>
             <w:tcBorders/>
             <w:shd w:color="auto" w:fill="BFBFBF" w:themeFill="background1" w:themeFillShade="bf" w:val="clear"/>
           </w:tcPr>
@@ -3515,7 +3527,7 @@
         </w:tc>
         <w:tc>
           <w:tcPr>
-            <w:tcW w:w="1508" w:type="dxa"/>
+            <w:tcW w:w="1511" w:type="dxa"/>
             <w:tcBorders/>
             <w:shd w:color="auto" w:fill="BFBFBF" w:themeFill="background1" w:themeFillShade="bf" w:val="clear"/>
           </w:tcPr>
@@ -3548,6 +3560,38 @@
         </w:trPr>
         <w:tc>
           <w:tcPr>
+            <w:tcW w:w="2343" w:type="dxa"/>
+            <w:tcBorders>
+              <w:end w:val="nil"/>
+            </w:tcBorders>
+          </w:tcPr>
+          <w:p>
+            <w:pPr>
+              <w:pStyle w:val="Normal"/>
+              <w:widowControl/>
+              <w:suppressAutoHyphens w:val="true"/>
+              <w:spacing w:before="0" w:after="0"/>
+              <w:jc w:val="start"/>
+              <w:rPr>
+                <w:rFonts w:eastAsia="Arial Unicode MS" w:cs="Arial"/>
+                <w:sz w:val="18"/>
+                <w:szCs w:val="18"/>
+                <w:lang w:val="pt-PT"/>
+              </w:rPr>
+            </w:pPr>
+            <w:r>
+              <w:rPr>
+                <w:rFonts w:eastAsia="Arial Unicode MS" w:cs="Arial"/>
+                <w:sz w:val="18"/>
+                <w:szCs w:val="18"/>
+                <w:lang w:val="pt-PT"/>
+              </w:rPr>
+              <w:t>{{components_memory_manufacturer}}</w:t>
+            </w:r>
+          </w:p>
+        </w:tc>
+        <w:tc>
+          <w:tcPr>
             <w:tcW w:w="2344" w:type="dxa"/>
             <w:tcBorders>
               <w:end w:val="nil"/>
@@ -3568,19 +3612,46 @@
               </w:rPr>
             </w:pPr>
             <w:r>
+              <w:rPr/>
+              <w:t>{{components_memory_model}}</w:t>
+            </w:r>
+          </w:p>
+        </w:tc>
+        <w:tc>
+          <w:tcPr>
+            <w:tcW w:w="1698" w:type="dxa"/>
+            <w:tcBorders>
+              <w:end w:val="nil"/>
+            </w:tcBorders>
+          </w:tcPr>
+          <w:p>
+            <w:pPr>
+              <w:pStyle w:val="Normal"/>
+              <w:widowControl/>
+              <w:suppressAutoHyphens w:val="true"/>
+              <w:spacing w:before="0" w:after="0"/>
+              <w:jc w:val="start"/>
               <w:rPr>
                 <w:rFonts w:eastAsia="Arial Unicode MS" w:cs="Arial"/>
                 <w:sz w:val="18"/>
                 <w:szCs w:val="18"/>
                 <w:lang w:val="pt-PT"/>
               </w:rPr>
-              <w:t>{{components_memory_manufacturer}}</w:t>
-            </w:r>
-          </w:p>
-        </w:tc>
-        <w:tc>
-          <w:tcPr>
-            <w:tcW w:w="2346" w:type="dxa"/>
+            </w:pPr>
+            <w:r>
+              <w:rPr>
+                <w:rFonts w:eastAsia="Arial Unicode MS" w:cs="Arial"/>
+                <w:sz w:val="18"/>
+                <w:szCs w:val="18"/>
+                <w:lang w:val="pt-PT"/>
+              </w:rPr>
+              <w:t>{{components_memory_type}}</w:t>
+            </w:r>
+          </w:p>
+        </w:tc>
+        <w:tc>
+          <w:tcPr>
+            <w:tcW w:w="1590" w:type="dxa"/>
             <w:tcBorders>
               <w:end w:val="nil"/>
             </w:tcBorders>
@@ -3600,78 +3671,19 @@
               </w:rPr>
             </w:pPr>
             <w:r>
-              <w:rPr/>
-              <w:t>{{components_memory_model}}</w:t>
-            </w:r>
-          </w:p>
-        </w:tc>
-        <w:tc>
-          <w:tcPr>
-            <w:tcW w:w="1695" w:type="dxa"/>
-            <w:tcBorders>
-              <w:end w:val="nil"/>
-            </w:tcBorders>
-          </w:tcPr>
-          <w:p>
-            <w:pPr>
-              <w:pStyle w:val="Normal"/>
-              <w:widowControl/>
-              <w:suppressAutoHyphens w:val="true"/>
-              <w:spacing w:before="0" w:after="0"/>
-              <w:jc w:val="start"/>
               <w:rPr>
                 <w:rFonts w:eastAsia="Arial Unicode MS" w:cs="Arial"/>
                 <w:sz w:val="18"/>
                 <w:szCs w:val="18"/>
                 <w:lang w:val="pt-PT"/>
               </w:rPr>
-            </w:pPr>
-            <w:r>
-              <w:rPr>
-                <w:rFonts w:eastAsia="Arial Unicode MS" w:cs="Arial"/>
-                <w:sz w:val="18"/>
-                <w:szCs w:val="18"/>
-                <w:lang w:val="pt-PT"/>
-              </w:rPr>
-              <w:t>{{components_memory_type}}</w:t>
-            </w:r>
-          </w:p>
-        </w:tc>
-        <w:tc>
-          <w:tcPr>
-            <w:tcW w:w="1593" w:type="dxa"/>
-            <w:tcBorders>
-              <w:end w:val="nil"/>
-            </w:tcBorders>
-          </w:tcPr>
-          <w:p>
-            <w:pPr>
-              <w:pStyle w:val="Normal"/>
-              <w:widowControl/>
-              <w:suppressAutoHyphens w:val="true"/>
-              <w:spacing w:before="0" w:after="0"/>
-              <w:jc w:val="start"/>
-              <w:rPr>
-                <w:rFonts w:eastAsia="Arial Unicode MS" w:cs="Arial"/>
-                <w:sz w:val="18"/>
-                <w:szCs w:val="18"/>
-                <w:lang w:val="pt-PT"/>
-              </w:rPr>
-            </w:pPr>
-            <w:r>
-              <w:rPr>
-                <w:rFonts w:eastAsia="Arial Unicode MS" w:cs="Arial"/>
-                <w:sz w:val="18"/>
-                <w:szCs w:val="18"/>
-                <w:lang w:val="pt-PT"/>
-              </w:rPr>
               <w:t>{{components_memory_size}}</w:t>
             </w:r>
           </w:p>
         </w:tc>
         <w:tc>
           <w:tcPr>
-            <w:tcW w:w="1508" w:type="dxa"/>
+            <w:tcW w:w="1511" w:type="dxa"/>
             <w:tcBorders/>
           </w:tcPr>
           <w:p>
@@ -3717,7 +3729,7 @@
       </w:pPr>
       <w:r>
         <w:rPr/>
-        <w:t>Fesplatten</w:t>
+        <w:t>Festplatten</w:t>
       </w:r>
     </w:p>
     <w:p>
@@ -3745,16 +3757,16 @@
         <w:tblLook w:noHBand="0" w:noVBand="1" w:firstColumn="1" w:lastRow="0" w:lastColumn="0" w:firstRow="1" w:val="04a0"/>
       </w:tblPr>
       <w:tblGrid>
+        <w:gridCol w:w="2343"/>
         <w:gridCol w:w="2344"/>
-        <w:gridCol w:w="2346"/>
-        <w:gridCol w:w="1695"/>
+        <w:gridCol w:w="1698"/>
         <w:gridCol w:w="3101"/>
       </w:tblGrid>
       <w:tr>
         <w:trPr/>
         <w:tc>
           <w:tcPr>
-            <w:tcW w:w="2344" w:type="dxa"/>
+            <w:tcW w:w="2343" w:type="dxa"/>
             <w:tcBorders>
               <w:end w:val="nil"/>
             </w:tcBorders>
@@ -3784,7 +3796,7 @@
         </w:tc>
         <w:tc>
           <w:tcPr>
-            <w:tcW w:w="2346" w:type="dxa"/>
+            <w:tcW w:w="2344" w:type="dxa"/>
             <w:tcBorders/>
             <w:shd w:color="auto" w:fill="BFBFBF" w:themeFill="background1" w:themeFillShade="bf" w:val="clear"/>
           </w:tcPr>
@@ -3812,7 +3824,7 @@
         </w:tc>
         <w:tc>
           <w:tcPr>
-            <w:tcW w:w="1695" w:type="dxa"/>
+            <w:tcW w:w="1698" w:type="dxa"/>
             <w:tcBorders/>
             <w:shd w:color="auto" w:fill="BFBFBF" w:themeFill="background1" w:themeFillShade="bf" w:val="clear"/>
           </w:tcPr>
@@ -3873,6 +3885,38 @@
         </w:trPr>
         <w:tc>
           <w:tcPr>
+            <w:tcW w:w="2343" w:type="dxa"/>
+            <w:tcBorders>
+              <w:end w:val="nil"/>
+            </w:tcBorders>
+          </w:tcPr>
+          <w:p>
+            <w:pPr>
+              <w:pStyle w:val="Normal"/>
+              <w:widowControl/>
+              <w:suppressAutoHyphens w:val="true"/>
+              <w:spacing w:before="0" w:after="0"/>
+              <w:jc w:val="start"/>
+              <w:rPr>
+                <w:rFonts w:eastAsia="Arial Unicode MS" w:cs="Arial"/>
+                <w:sz w:val="18"/>
+                <w:szCs w:val="18"/>
+                <w:lang w:val="pt-PT"/>
+              </w:rPr>
+            </w:pPr>
+            <w:r>
+              <w:rPr>
+                <w:rFonts w:eastAsia="Arial Unicode MS" w:cs="Arial"/>
+                <w:sz w:val="18"/>
+                <w:szCs w:val="18"/>
+                <w:lang w:val="pt-PT"/>
+              </w:rPr>
+              <w:t>{{components_harddrive_manufacturer}}</w:t>
+            </w:r>
+          </w:p>
+        </w:tc>
+        <w:tc>
+          <w:tcPr>
             <w:tcW w:w="2344" w:type="dxa"/>
             <w:tcBorders>
               <w:end w:val="nil"/>
@@ -3893,38 +3937,6 @@
               </w:rPr>
             </w:pPr>
             <w:r>
-              <w:rPr>
-                <w:rFonts w:eastAsia="Arial Unicode MS" w:cs="Arial"/>
-                <w:sz w:val="18"/>
-                <w:szCs w:val="18"/>
-                <w:lang w:val="pt-PT"/>
-              </w:rPr>
-              <w:t>{{components_harddrive_manufacturer}}</w:t>
-            </w:r>
-          </w:p>
-        </w:tc>
-        <w:tc>
-          <w:tcPr>
-            <w:tcW w:w="2346" w:type="dxa"/>
-            <w:tcBorders>
-              <w:end w:val="nil"/>
-            </w:tcBorders>
-          </w:tcPr>
-          <w:p>
-            <w:pPr>
-              <w:pStyle w:val="Normal"/>
-              <w:widowControl/>
-              <w:suppressAutoHyphens w:val="true"/>
-              <w:spacing w:before="0" w:after="0"/>
-              <w:jc w:val="start"/>
-              <w:rPr>
-                <w:rFonts w:eastAsia="Arial Unicode MS" w:cs="Arial"/>
-                <w:sz w:val="18"/>
-                <w:szCs w:val="18"/>
-                <w:lang w:val="pt-PT"/>
-              </w:rPr>
-            </w:pPr>
-            <w:r>
               <w:rPr/>
               <w:t>{{components_harddrive_model}}</w:t>
             </w:r>
@@ -3932,7 +3944,7 @@
         </w:tc>
         <w:tc>
           <w:tcPr>
-            <w:tcW w:w="1695" w:type="dxa"/>
+            <w:tcW w:w="1698" w:type="dxa"/>
             <w:tcBorders>
               <w:end w:val="nil"/>
             </w:tcBorders>
@@ -4038,16 +4050,16 @@
         <w:tblLook w:noHBand="0" w:noVBand="1" w:firstColumn="1" w:lastRow="0" w:lastColumn="0" w:firstRow="1" w:val="04a0"/>
       </w:tblPr>
       <w:tblGrid>
+        <w:gridCol w:w="2343"/>
         <w:gridCol w:w="2344"/>
-        <w:gridCol w:w="2346"/>
-        <w:gridCol w:w="1695"/>
+        <w:gridCol w:w="1698"/>
         <w:gridCol w:w="3101"/>
       </w:tblGrid>
       <w:tr>
         <w:trPr/>
         <w:tc>
           <w:tcPr>
-            <w:tcW w:w="2344" w:type="dxa"/>
+            <w:tcW w:w="2343" w:type="dxa"/>
             <w:tcBorders>
               <w:end w:val="nil"/>
             </w:tcBorders>
@@ -4077,7 +4089,7 @@
         </w:tc>
         <w:tc>
           <w:tcPr>
-            <w:tcW w:w="2346" w:type="dxa"/>
+            <w:tcW w:w="2344" w:type="dxa"/>
             <w:tcBorders/>
             <w:shd w:color="auto" w:fill="BFBFBF" w:themeFill="background1" w:themeFillShade="bf" w:val="clear"/>
           </w:tcPr>
@@ -4105,7 +4117,7 @@
         </w:tc>
         <w:tc>
           <w:tcPr>
-            <w:tcW w:w="1695" w:type="dxa"/>
+            <w:tcW w:w="1698" w:type="dxa"/>
             <w:tcBorders/>
             <w:shd w:color="auto" w:fill="BFBFBF" w:themeFill="background1" w:themeFillShade="bf" w:val="clear"/>
           </w:tcPr>
@@ -4166,6 +4178,38 @@
         </w:trPr>
         <w:tc>
           <w:tcPr>
+            <w:tcW w:w="2343" w:type="dxa"/>
+            <w:tcBorders>
+              <w:end w:val="nil"/>
+            </w:tcBorders>
+          </w:tcPr>
+          <w:p>
+            <w:pPr>
+              <w:pStyle w:val="Normal"/>
+              <w:widowControl/>
+              <w:suppressAutoHyphens w:val="true"/>
+              <w:spacing w:before="0" w:after="0"/>
+              <w:jc w:val="start"/>
+              <w:rPr>
+                <w:rFonts w:eastAsia="Arial Unicode MS" w:cs="Arial"/>
+                <w:sz w:val="18"/>
+                <w:szCs w:val="18"/>
+                <w:lang w:val="pt-PT"/>
+              </w:rPr>
+            </w:pPr>
+            <w:r>
+              <w:rPr>
+                <w:rFonts w:eastAsia="Arial Unicode MS" w:cs="Arial"/>
+                <w:sz w:val="18"/>
+                <w:szCs w:val="18"/>
+                <w:lang w:val="pt-PT"/>
+              </w:rPr>
+              <w:t>{{components_networkcard_manufacturer}}</w:t>
+            </w:r>
+          </w:p>
+        </w:tc>
+        <w:tc>
+          <w:tcPr>
             <w:tcW w:w="2344" w:type="dxa"/>
             <w:tcBorders>
               <w:end w:val="nil"/>
@@ -4186,38 +4230,6 @@
               </w:rPr>
             </w:pPr>
             <w:r>
-              <w:rPr>
-                <w:rFonts w:eastAsia="Arial Unicode MS" w:cs="Arial"/>
-                <w:sz w:val="18"/>
-                <w:szCs w:val="18"/>
-                <w:lang w:val="pt-PT"/>
-              </w:rPr>
-              <w:t>{{components_networkcard_manufacturer}}</w:t>
-            </w:r>
-          </w:p>
-        </w:tc>
-        <w:tc>
-          <w:tcPr>
-            <w:tcW w:w="2346" w:type="dxa"/>
-            <w:tcBorders>
-              <w:end w:val="nil"/>
-            </w:tcBorders>
-          </w:tcPr>
-          <w:p>
-            <w:pPr>
-              <w:pStyle w:val="Normal"/>
-              <w:widowControl/>
-              <w:suppressAutoHyphens w:val="true"/>
-              <w:spacing w:before="0" w:after="0"/>
-              <w:jc w:val="start"/>
-              <w:rPr>
-                <w:rFonts w:eastAsia="Arial Unicode MS" w:cs="Arial"/>
-                <w:sz w:val="18"/>
-                <w:szCs w:val="18"/>
-                <w:lang w:val="pt-PT"/>
-              </w:rPr>
-            </w:pPr>
-            <w:r>
               <w:rPr/>
               <w:t>{{components_networkcard_model}}</w:t>
             </w:r>
@@ -4225,7 +4237,7 @@
         </w:tc>
         <w:tc>
           <w:tcPr>
-            <w:tcW w:w="1695" w:type="dxa"/>
+            <w:tcW w:w="1698" w:type="dxa"/>
             <w:tcBorders>
               <w:end w:val="nil"/>
             </w:tcBorders>
@@ -4331,9 +4343,9 @@
         <w:tblLook w:noHBand="0" w:noVBand="1" w:firstColumn="1" w:lastRow="0" w:lastColumn="0" w:firstRow="1" w:val="04a0"/>
       </w:tblPr>
       <w:tblGrid>
-        <w:gridCol w:w="1164"/>
-        <w:gridCol w:w="1168"/>
-        <w:gridCol w:w="2385"/>
+        <w:gridCol w:w="1162"/>
+        <w:gridCol w:w="1167"/>
+        <w:gridCol w:w="2388"/>
         <w:gridCol w:w="2385"/>
         <w:gridCol w:w="2384"/>
       </w:tblGrid>
@@ -4341,7 +4353,7 @@
         <w:trPr/>
         <w:tc>
           <w:tcPr>
-            <w:tcW w:w="1164" w:type="dxa"/>
+            <w:tcW w:w="1162" w:type="dxa"/>
             <w:tcBorders>
               <w:end w:val="nil"/>
             </w:tcBorders>
@@ -4371,7 +4383,7 @@
         </w:tc>
         <w:tc>
           <w:tcPr>
-            <w:tcW w:w="1168" w:type="dxa"/>
+            <w:tcW w:w="1167" w:type="dxa"/>
             <w:tcBorders/>
             <w:shd w:color="auto" w:fill="BFBFBF" w:themeFill="background1" w:themeFillShade="bf" w:val="clear"/>
           </w:tcPr>
@@ -4399,6 +4411,36 @@
         </w:tc>
         <w:tc>
           <w:tcPr>
+            <w:tcW w:w="2388" w:type="dxa"/>
+            <w:tcBorders>
+              <w:end w:val="nil"/>
+            </w:tcBorders>
+            <w:shd w:color="auto" w:fill="BFBFBF" w:themeFill="background1" w:themeFillShade="bf" w:val="clear"/>
+          </w:tcPr>
+          <w:p>
+            <w:pPr>
+              <w:pStyle w:val="TableHead"/>
+              <w:widowControl/>
+              <w:suppressAutoHyphens w:val="true"/>
+              <w:spacing w:before="60" w:after="60"/>
+              <w:jc w:val="start"/>
+              <w:rPr>
+                <w:rFonts w:ascii="Arial" w:hAnsi="Arial"/>
+                <w:kern w:val="0"/>
+                <w:lang w:bidi="ar-SA"/>
+              </w:rPr>
+            </w:pPr>
+            <w:r>
+              <w:rPr>
+                <w:kern w:val="0"/>
+                <w:lang w:bidi="ar-SA"/>
+              </w:rPr>
+              <w:t>Memory</w:t>
+            </w:r>
+          </w:p>
+        </w:tc>
+        <w:tc>
+          <w:tcPr>
             <w:tcW w:w="2385" w:type="dxa"/>
             <w:tcBorders>
               <w:end w:val="nil"/>
@@ -4423,16 +4465,14 @@
                 <w:kern w:val="0"/>
                 <w:lang w:bidi="ar-SA"/>
               </w:rPr>
-              <w:t>Memory</w:t>
-            </w:r>
-          </w:p>
-        </w:tc>
-        <w:tc>
-          <w:tcPr>
-            <w:tcW w:w="2385" w:type="dxa"/>
-            <w:tcBorders>
-              <w:end w:val="nil"/>
-            </w:tcBorders>
+              <w:t>Interface</w:t>
+            </w:r>
+          </w:p>
+        </w:tc>
+        <w:tc>
+          <w:tcPr>
+            <w:tcW w:w="2384" w:type="dxa"/>
+            <w:tcBorders/>
             <w:shd w:color="auto" w:fill="BFBFBF" w:themeFill="background1" w:themeFillShade="bf" w:val="clear"/>
           </w:tcPr>
           <w:p>
@@ -4453,34 +4493,6 @@
                 <w:kern w:val="0"/>
                 <w:lang w:bidi="ar-SA"/>
               </w:rPr>
-              <w:t>Interface</w:t>
-            </w:r>
-          </w:p>
-        </w:tc>
-        <w:tc>
-          <w:tcPr>
-            <w:tcW w:w="2384" w:type="dxa"/>
-            <w:tcBorders/>
-            <w:shd w:color="auto" w:fill="BFBFBF" w:themeFill="background1" w:themeFillShade="bf" w:val="clear"/>
-          </w:tcPr>
-          <w:p>
-            <w:pPr>
-              <w:pStyle w:val="TableHead"/>
-              <w:widowControl/>
-              <w:suppressAutoHyphens w:val="true"/>
-              <w:spacing w:before="60" w:after="60"/>
-              <w:jc w:val="start"/>
-              <w:rPr>
-                <w:rFonts w:ascii="Arial" w:hAnsi="Arial"/>
-                <w:kern w:val="0"/>
-                <w:lang w:bidi="ar-SA"/>
-              </w:rPr>
-            </w:pPr>
-            <w:r>
-              <w:rPr>
-                <w:kern w:val="0"/>
-                <w:lang w:bidi="ar-SA"/>
-              </w:rPr>
               <w:t>Seriennummer</w:t>
             </w:r>
           </w:p>
@@ -4492,7 +4504,7 @@
         </w:trPr>
         <w:tc>
           <w:tcPr>
-            <w:tcW w:w="1164" w:type="dxa"/>
+            <w:tcW w:w="1162" w:type="dxa"/>
             <w:tcBorders>
               <w:end w:val="nil"/>
             </w:tcBorders>
@@ -4524,7 +4536,7 @@
         </w:tc>
         <w:tc>
           <w:tcPr>
-            <w:tcW w:w="1168" w:type="dxa"/>
+            <w:tcW w:w="1167" w:type="dxa"/>
             <w:tcBorders>
               <w:end w:val="nil"/>
             </w:tcBorders>
@@ -4564,7 +4576,7 @@
         </w:tc>
         <w:tc>
           <w:tcPr>
-            <w:tcW w:w="2385" w:type="dxa"/>
+            <w:tcW w:w="2388" w:type="dxa"/>
             <w:tcBorders>
               <w:end w:val="nil"/>
             </w:tcBorders>
@@ -4693,8 +4705,8 @@
       </w:tblPr>
       <w:tblGrid>
         <w:gridCol w:w="2575"/>
-        <w:gridCol w:w="1857"/>
-        <w:gridCol w:w="1750"/>
+        <w:gridCol w:w="1854"/>
+        <w:gridCol w:w="1753"/>
         <w:gridCol w:w="1653"/>
         <w:gridCol w:w="1651"/>
       </w:tblGrid>
@@ -4730,7 +4742,7 @@
         </w:tc>
         <w:tc>
           <w:tcPr>
-            <w:tcW w:w="1857" w:type="dxa"/>
+            <w:tcW w:w="1854" w:type="dxa"/>
             <w:tcBorders/>
             <w:shd w:color="auto" w:fill="BFBFBF" w:themeFill="background1" w:themeFillShade="bf" w:val="clear"/>
           </w:tcPr>
@@ -4758,7 +4770,7 @@
         </w:tc>
         <w:tc>
           <w:tcPr>
-            <w:tcW w:w="1750" w:type="dxa"/>
+            <w:tcW w:w="1753" w:type="dxa"/>
             <w:tcBorders/>
             <w:shd w:color="auto" w:fill="BFBFBF" w:themeFill="background1" w:themeFillShade="bf" w:val="clear"/>
           </w:tcPr>
@@ -4881,7 +4893,7 @@
         </w:tc>
         <w:tc>
           <w:tcPr>
-            <w:tcW w:w="1857" w:type="dxa"/>
+            <w:tcW w:w="1854" w:type="dxa"/>
             <w:tcBorders>
               <w:end w:val="nil"/>
             </w:tcBorders>
@@ -4913,7 +4925,7 @@
         </w:tc>
         <w:tc>
           <w:tcPr>
-            <w:tcW w:w="1750" w:type="dxa"/>
+            <w:tcW w:w="1753" w:type="dxa"/>
             <w:tcBorders>
               <w:end w:val="nil"/>
             </w:tcBorders>
@@ -6373,8 +6385,8 @@
       <w:tblLook w:noHBand="0" w:noVBand="0" w:firstColumn="0" w:lastRow="0" w:lastColumn="0" w:firstRow="0" w:val="0000"/>
     </w:tblPr>
     <w:tblGrid>
-      <w:gridCol w:w="2544"/>
-      <w:gridCol w:w="7096"/>
+      <w:gridCol w:w="2543"/>
+      <w:gridCol w:w="7097"/>
     </w:tblGrid>
     <w:tr>
       <w:trPr>
@@ -6382,7 +6394,7 @@
       </w:trPr>
       <w:tc>
         <w:tcPr>
-          <w:tcW w:w="2544" w:type="dxa"/>
+          <w:tcW w:w="2543" w:type="dxa"/>
           <w:tcBorders>
             <w:bottom w:val="single" w:sz="12" w:space="0" w:color="000000"/>
           </w:tcBorders>
@@ -6417,14 +6429,14 @@
               <v:shape id="ole_rId1" type="_x0000_tole_rId1" style="width:114.6pt;height:19.8pt;mso-wrap-distance-right:0pt" filled="f" o:ole="">
                 <v:imagedata r:id="rId2" o:title=""/>
               </v:shape>
-              <o:OLEObject Type="Embed" ProgID="MSDraw" ShapeID="ole_rId1" DrawAspect="Content" ObjectID="_1379086440" r:id="rId1"/>
+              <o:OLEObject Type="Embed" ProgID="MSDraw" ShapeID="ole_rId1" DrawAspect="Content" ObjectID="_1672368708" r:id="rId1"/>
             </w:object>
           </w:r>
         </w:p>
       </w:tc>
       <w:tc>
         <w:tcPr>
-          <w:tcW w:w="7096" w:type="dxa"/>
+          <w:tcW w:w="7097" w:type="dxa"/>
           <w:tcBorders>
             <w:bottom w:val="single" w:sz="12" w:space="0" w:color="000000"/>
           </w:tcBorders>
@@ -6475,8 +6487,8 @@
       <w:tblLook w:noHBand="0" w:noVBand="0" w:firstColumn="0" w:lastRow="0" w:lastColumn="0" w:firstRow="0" w:val="0000"/>
     </w:tblPr>
     <w:tblGrid>
-      <w:gridCol w:w="2544"/>
-      <w:gridCol w:w="7096"/>
+      <w:gridCol w:w="2543"/>
+      <w:gridCol w:w="7097"/>
     </w:tblGrid>
     <w:tr>
       <w:trPr>
@@ -6484,7 +6496,7 @@
       </w:trPr>
       <w:tc>
         <w:tcPr>
-          <w:tcW w:w="2544" w:type="dxa"/>
+          <w:tcW w:w="2543" w:type="dxa"/>
           <w:tcBorders>
             <w:bottom w:val="single" w:sz="12" w:space="0" w:color="000000"/>
           </w:tcBorders>
@@ -6519,14 +6531,14 @@
               <v:shape id="ole_rId1" type="_x0000_tole_rId1" style="width:114.6pt;height:19.8pt;mso-wrap-distance-right:0pt" filled="f" o:ole="">
                 <v:imagedata r:id="rId2" o:title=""/>
               </v:shape>
-              <o:OLEObject Type="Embed" ProgID="MSDraw" ShapeID="ole_rId1" DrawAspect="Content" ObjectID="_2003948364" r:id="rId1"/>
+              <o:OLEObject Type="Embed" ProgID="MSDraw" ShapeID="ole_rId1" DrawAspect="Content" ObjectID="_1638590875" r:id="rId1"/>
             </w:object>
           </w:r>
         </w:p>
       </w:tc>
       <w:tc>
         <w:tcPr>
-          <w:tcW w:w="7096" w:type="dxa"/>
+          <w:tcW w:w="7097" w:type="dxa"/>
           <w:tcBorders>
             <w:bottom w:val="single" w:sz="12" w:space="0" w:color="000000"/>
           </w:tcBorders>
@@ -8050,15 +8062,15 @@
       <w:lang w:val="de-DE" w:eastAsia="de-DE"/>
     </w:rPr>
   </w:style>
-  <w:style w:type="character" w:styleId="FootnoteCharactersuser">
-    <w:name w:val="Footnote Characters (user)"/>
+  <w:style w:type="character" w:styleId="FootnoteCharacters">
+    <w:name w:val="Footnote Characters"/>
     <w:qFormat/>
     <w:rPr>
       <w:vertAlign w:val="superscript"/>
     </w:rPr>
   </w:style>
-  <w:style w:type="character" w:styleId="FootnoteCharacters">
-    <w:name w:val="Footnote Characters"/>
+  <w:style w:type="character" w:styleId="FootnoteCharactersuser">
+    <w:name w:val="Footnote Characters (user)"/>
     <w:qFormat/>
     <w:rPr>
       <w:vertAlign w:val="superscript"/>
@@ -8825,15 +8837,15 @@
       <w:lang w:val="es-ES"/>
     </w:rPr>
   </w:style>
-  <w:style w:type="paragraph" w:styleId="FrameContentsuser">
-    <w:name w:val="Frame Contents (user)"/>
+  <w:style w:type="paragraph" w:styleId="FrameContents">
+    <w:name w:val="Frame Contents"/>
     <w:basedOn w:val="Normal"/>
     <w:qFormat/>
     <w:pPr/>
     <w:rPr/>
   </w:style>
-  <w:style w:type="paragraph" w:styleId="FrameContents">
-    <w:name w:val="Frame Contents"/>
+  <w:style w:type="paragraph" w:styleId="FrameContentsuser">
+    <w:name w:val="Frame Contents (user)"/>
     <w:basedOn w:val="Normal"/>
     <w:qFormat/>
     <w:pPr/>

</xml_diff>